<commit_message>
Show where an accreditation comes from: DOT Accredited, Sample Data, Not Yet Verified
Reuses accreditation_records.is_placeholder (no new column). A listing is official only with a
non-placeholder record that has a number; all-placeholder records are sample data; no record, or
records without a number, is Not Yet Verified and is never read as official. The label is the
same on catalogue cards, listing pages, the chatbot and the planner panel, and the home page
and site description no longer call every listing DOT-verified.

Eligibility is unchanged: sample and unverified listings still take part in the recommender,
Apriori, itinerary generation and sequencing. Tests flip only the provenance and require
identical rankings, stops, order and stays.

Co-Authored-By: Claude Sonnet 5.5 <noreply@anthropic.com>
</commit_message>
<xml_diff>
--- a/docs/ExploreDVO_Implementation_Changes.docx
+++ b/docs/ExploreDVO_Implementation_Changes.docx
@@ -10559,6 +10559,231 @@
         <w:t>Update: all “Required” items (1—7, 14—16, 22, 26—28), both “Decision needed” items (9—10, reworded to match the system as built), and all seven original “Optional” items (8, 11, 17—20, 29) are now marked “Done” above (shaded green) and have been applied directly to the manuscript — see “ExploreDVO_corrected_text_with_original_images_v4.docx” in Downloads (the file was v3 through item 32; item 33 below is what moved it to v4). Every inserted or changed piece of text and every new ERD entity/connector is colored blue in that file so you can see exactly what changed at a glance. Items 31 and 32 were added after the AI/recommendation modules (§5.19—5.22) went live, closing two small gaps that only became visible once those features were real: a footnote explaining how the Preference Match formula scores categories with no direct destination-side data, and a correction to the itinerary baseline-location wording to match the actual fallback behavior. Item 33 was added after DOT raised the visitor double-counting concern in person, resulting in the QR/manual check-in feature, the new Verified Visits report, and a database-level uniqueness constraint (§5.23). All three are also Done. Only the “No action needed” items remain untouched, by design.</w:t>
       </w:r>
     </w:p>
+    <w:p>
+      <w:pPr>
+        <w:pStyle w:val="Heading1"/>
+      </w:pPr>
+      <w:r>
+        <w:t>10. Work in Progress (Not Merged): Accreditation Labels (DOT Accredited, Sample Data, Not Yet Verified)</w:t>
+      </w:r>
+    </w:p>
+    <w:p>
+      <w:r>
+        <w:rPr>
+          <w:b/>
+        </w:rPr>
+        <w:t>STATUS: implemented on the local branch feature/data-provenance-labels. NOT approved for merging. NOT deployed. Separate from the stay-continuity work (feature/stay-continuity-stage1).</w:t>
+      </w:r>
+    </w:p>
+    <w:p>
+      <w:pPr>
+        <w:pStyle w:val="Heading2"/>
+      </w:pPr>
+      <w:r>
+        <w:t>10.1 What it does</w:t>
+      </w:r>
+    </w:p>
+    <w:p>
+      <w:r>
+        <w:t>Every listing is shown as exactly one of three things, decided from its accreditation records (accreditation_records, using the existing is_placeholder flag; no new column):</w:t>
+      </w:r>
+    </w:p>
+    <w:tbl>
+      <w:tblPr>
+        <w:tblStyle w:val="LightGrid-Accent1"/>
+        <w:tblW w:type="auto" w:w="0"/>
+        <w:tblLook w:firstColumn="1" w:firstRow="1" w:lastColumn="0" w:lastRow="0" w:noHBand="0" w:noVBand="1" w:val="04A0"/>
+      </w:tblPr>
+      <w:tblGrid>
+        <w:gridCol w:w="2880"/>
+        <w:gridCol w:w="2880"/>
+        <w:gridCol w:w="2880"/>
+      </w:tblGrid>
+      <w:tr>
+        <w:tc>
+          <w:tcPr>
+            <w:tcW w:type="dxa" w:w="2880"/>
+          </w:tcPr>
+          <w:p>
+            <w:r>
+              <w:t>Label</w:t>
+            </w:r>
+          </w:p>
+        </w:tc>
+        <w:tc>
+          <w:tcPr>
+            <w:tcW w:type="dxa" w:w="2880"/>
+          </w:tcPr>
+          <w:p>
+            <w:r>
+              <w:t>Rule</w:t>
+            </w:r>
+          </w:p>
+        </w:tc>
+        <w:tc>
+          <w:tcPr>
+            <w:tcW w:type="dxa" w:w="2880"/>
+          </w:tcPr>
+          <w:p>
+            <w:r>
+              <w:t>Meaning</w:t>
+            </w:r>
+          </w:p>
+        </w:tc>
+      </w:tr>
+      <w:tr>
+        <w:tc>
+          <w:tcPr>
+            <w:tcW w:type="dxa" w:w="2880"/>
+          </w:tcPr>
+          <w:p>
+            <w:r>
+              <w:t>DOT Accredited</w:t>
+            </w:r>
+          </w:p>
+        </w:tc>
+        <w:tc>
+          <w:tcPr>
+            <w:tcW w:type="dxa" w:w="2880"/>
+          </w:tcPr>
+          <w:p>
+            <w:r>
+              <w:t>at least one record that is not a placeholder and carries an accreditation number</w:t>
+            </w:r>
+          </w:p>
+        </w:tc>
+        <w:tc>
+          <w:tcPr>
+            <w:tcW w:type="dxa" w:w="2880"/>
+          </w:tcPr>
+          <w:p>
+            <w:r>
+              <w:t>official DOT record</w:t>
+            </w:r>
+          </w:p>
+        </w:tc>
+      </w:tr>
+      <w:tr>
+        <w:tc>
+          <w:tcPr>
+            <w:tcW w:type="dxa" w:w="2880"/>
+          </w:tcPr>
+          <w:p>
+            <w:r>
+              <w:t>Sample Data</w:t>
+            </w:r>
+          </w:p>
+        </w:tc>
+        <w:tc>
+          <w:tcPr>
+            <w:tcW w:type="dxa" w:w="2880"/>
+          </w:tcPr>
+          <w:p>
+            <w:r>
+              <w:t>every record is a placeholder (our number, not DOT's)</w:t>
+            </w:r>
+          </w:p>
+        </w:tc>
+        <w:tc>
+          <w:tcPr>
+            <w:tcW w:type="dxa" w:w="2880"/>
+          </w:tcPr>
+          <w:p>
+            <w:r>
+              <w:t>temporary demonstration record</w:t>
+            </w:r>
+          </w:p>
+        </w:tc>
+      </w:tr>
+      <w:tr>
+        <w:tc>
+          <w:tcPr>
+            <w:tcW w:type="dxa" w:w="2880"/>
+          </w:tcPr>
+          <w:p>
+            <w:r>
+              <w:t>Not Yet Verified</w:t>
+            </w:r>
+          </w:p>
+        </w:tc>
+        <w:tc>
+          <w:tcPr>
+            <w:tcW w:type="dxa" w:w="2880"/>
+          </w:tcPr>
+          <w:p>
+            <w:r>
+              <w:t>no accreditation record, or only records without a number</w:t>
+            </w:r>
+          </w:p>
+        </w:tc>
+        <w:tc>
+          <w:tcPr>
+            <w:tcW w:type="dxa" w:w="2880"/>
+          </w:tcPr>
+          <w:p>
+            <w:r>
+              <w:t>accreditation cannot be confirmed</w:t>
+            </w:r>
+          </w:p>
+        </w:tc>
+      </w:tr>
+    </w:tbl>
+    <w:p/>
+    <w:p>
+      <w:r>
+        <w:t>A missing record is never read as official. The label is the same on the catalogue cards, the destination, stay, dining, souvenir, operator and package pages, the chatbot and the planner's provenance panel. Home-page wording that called every listing "DOT-verified" was replaced, and the site description no longer claims that all destinations are DOT-accredited.</w:t>
+      </w:r>
+    </w:p>
+    <w:p>
+      <w:pPr>
+        <w:pStyle w:val="Heading2"/>
+      </w:pPr>
+      <w:r>
+        <w:t>10.2 What it does not do</w:t>
+      </w:r>
+    </w:p>
+    <w:p>
+      <w:pPr>
+        <w:pStyle w:val="ListBullet"/>
+      </w:pPr>
+      <w:r>
+        <w:t>It does not change eligibility. Sample and Not Yet Verified listings stay in the Content-Based Recommendation, Apriori, itinerary generation and geographic sequencing, because those use the is_accredited flag only.</w:t>
+      </w:r>
+    </w:p>
+    <w:p>
+      <w:pPr>
+        <w:pStyle w:val="ListBullet"/>
+      </w:pPr>
+      <w:r>
+        <w:t>It does not change any recommendation algorithm or weight, any accreditation value, any expiry date, the grace setting, prices, or existing listing records.</w:t>
+      </w:r>
+    </w:p>
+    <w:p>
+      <w:pPr>
+        <w:pStyle w:val="Heading2"/>
+      </w:pPr>
+      <w:r>
+        <w:t>10.3 Verification</w:t>
+      </w:r>
+    </w:p>
+    <w:p>
+      <w:r>
+        <w:t>SampleParticipationTest plans the same catalogue with every record official, every record sample, no records, and a mix, and requires identical rankings (factor by factor), stops, order and stays; a control shows the comparison does detect a real difference. It also checks that Apriori treats a sample destination like an official one and that the recommendation code never reads provenance. ProvenanceStatusTest covers the three states on every surface.</w:t>
+      </w:r>
+    </w:p>
+    <w:p>
+      <w:pPr>
+        <w:pStyle w:val="Heading2"/>
+      </w:pPr>
+      <w:r>
+        <w:t>10.4 Test data, not verified DOT information</w:t>
+      </w:r>
+    </w:p>
+    <w:p>
+      <w:r>
+        <w:t>The sample records are a temporary beta-testing arrangement and must eventually be replaced with verified DOT records. Existing accreditation values, expiry dates and prices were not changed.</w:t>
+      </w:r>
+    </w:p>
     <w:sectPr>
       <w:pgSz w:w="12240" w:h="15840"/>
       <w:pgMar w:top="1440" w:right="1800" w:bottom="1440" w:left="1800" w:header="720" w:footer="720" w:gutter="0"/>

</xml_diff>

<commit_message>
Docs: refresh the Stage 1 section against the current main
Co-Authored-By: Claude Sonnet 5.5 <noreply@anthropic.com>
</commit_message>
<xml_diff>
--- a/docs/ExploreDVO_Implementation_Changes.docx
+++ b/docs/ExploreDVO_Implementation_Changes.docx
@@ -10572,7 +10572,7 @@
         <w:rPr>
           <w:b/>
         </w:rPr>
-        <w:t>STATUS: implemented on the local branch feature/stay-continuity-stage1. NOT approved for merging. NOT deployed. The figures below were measured on test data in a scratch copy of the database and are provisional, not final results.</w:t>
+        <w:t>STATUS: implemented on the branch feature/stay-continuity-stage1, opened as a pull request for review. NOT approved for merging. NOT deployed. The figures below were measured on test data in a scratch copy of the database and are provisional, not final results.</w:t>
       </w:r>
     </w:p>
     <w:p>
@@ -10664,7 +10664,7 @@
     </w:p>
     <w:p>
       <w:r>
-        <w:t>Two sets of 48 generated test trips (a calibration set and a separate held-out set that was used only for reporting), grace period on, penalty 30. These are provisional results on test data, not final results.</w:t>
+        <w:t>Two sets of 48 generated test trips (a calibration set and a separate held-out set that was used only for reporting), grace period on, penalty 30, measured against main at 6b53177 (which already has the 5 km Close Proximity and 15 to 50 km Commutable ranges). These are provisional results on test data, not final results.</w:t>
       </w:r>
     </w:p>
     <w:tbl>
@@ -10695,7 +10695,7 @@
           </w:tcPr>
           <w:p>
             <w:r>
-              <w:t>Before (live code)</w:t>
+              <w:t>Before (main)</w:t>
             </w:r>
           </w:p>
         </w:tc>
@@ -10705,7 +10705,7 @@
           </w:tcPr>
           <w:p>
             <w:r>
-              <w:t>Branch with the fix</w:t>
+              <w:t>Stage 1 branch</w:t>
             </w:r>
           </w:p>
         </w:tc>
@@ -10727,7 +10727,7 @@
           </w:tcPr>
           <w:p>
             <w:r>
-              <w:t>30 / 28</w:t>
+              <w:t>31 / 39</w:t>
             </w:r>
           </w:p>
         </w:tc>
@@ -10737,7 +10737,7 @@
           </w:tcPr>
           <w:p>
             <w:r>
-              <w:t>8 / 9</w:t>
+              <w:t>9 / 12</w:t>
             </w:r>
           </w:p>
         </w:tc>
@@ -10759,7 +10759,7 @@
           </w:tcPr>
           <w:p>
             <w:r>
-              <w:t>215 / 224</w:t>
+              <w:t>218 / 223</w:t>
             </w:r>
           </w:p>
         </w:tc>
@@ -10769,7 +10769,7 @@
           </w:tcPr>
           <w:p>
             <w:r>
-              <w:t>215 / 224</w:t>
+              <w:t>219 / 220</w:t>
             </w:r>
           </w:p>
         </w:tc>
@@ -10791,7 +10791,7 @@
           </w:tcPr>
           <w:p>
             <w:r>
-              <w:t>18 / 16</w:t>
+              <w:t>18 / 21</w:t>
             </w:r>
           </w:p>
         </w:tc>
@@ -10801,7 +10801,7 @@
           </w:tcPr>
           <w:p>
             <w:r>
-              <w:t>13 / 12</w:t>
+              <w:t>13 / 13</w:t>
             </w:r>
           </w:p>
         </w:tc>
@@ -10823,7 +10823,7 @@
           </w:tcPr>
           <w:p>
             <w:r>
-              <w:t>11 / 7</w:t>
+              <w:t>11 / 10</w:t>
             </w:r>
           </w:p>
         </w:tc>
@@ -10833,7 +10833,7 @@
           </w:tcPr>
           <w:p>
             <w:r>
-              <w:t>7 / 6</w:t>
+              <w:t>5 / 5</w:t>
             </w:r>
           </w:p>
         </w:tc>
@@ -10855,7 +10855,7 @@
           </w:tcPr>
           <w:p>
             <w:r>
-              <w:t>18,000 / 17,010</w:t>
+              <w:t>17,940 / 18,000</w:t>
             </w:r>
           </w:p>
         </w:tc>
@@ -10865,13 +10865,18 @@
           </w:tcPr>
           <w:p>
             <w:r>
-              <w:t>17,055 / 16,440</w:t>
+              <w:t>16,395 / 15,615</w:t>
             </w:r>
           </w:p>
         </w:tc>
       </w:tr>
     </w:tbl>
     <w:p/>
+    <w:p>
+      <w:r>
+        <w:t>Known cost: Close Proximity keeps one stay, so about 4 of the roughly 75 stops in the 16 Close Proximity trips of each set could not be placed; each is listed on the itinerary with the reason. Held-out coverage is 3 stops lower overall (calibration is 1 higher).</w:t>
+      </w:r>
+    </w:p>
     <w:p>
       <w:pPr>
         <w:pStyle w:val="Heading2"/>

</xml_diff>

<commit_message>
Provenance: keep the documentation in its own file, make the participation test follow the planner's real first choice
The documentation moves out of the shared .docx files so it cannot conflict with the stay-continuity
pull request, and now states plainly that the Apriori survey data is simulated testing data.

Co-Authored-By: Claude Sonnet 5.5 <noreply@anthropic.com>
</commit_message>
<xml_diff>
--- a/docs/ExploreDVO_Implementation_Changes.docx
+++ b/docs/ExploreDVO_Implementation_Changes.docx
@@ -10559,231 +10559,6 @@
         <w:t>Update: all “Required” items (1—7, 14—16, 22, 26—28), both “Decision needed” items (9—10, reworded to match the system as built), and all seven original “Optional” items (8, 11, 17—20, 29) are now marked “Done” above (shaded green) and have been applied directly to the manuscript — see “ExploreDVO_corrected_text_with_original_images_v4.docx” in Downloads (the file was v3 through item 32; item 33 below is what moved it to v4). Every inserted or changed piece of text and every new ERD entity/connector is colored blue in that file so you can see exactly what changed at a glance. Items 31 and 32 were added after the AI/recommendation modules (§5.19—5.22) went live, closing two small gaps that only became visible once those features were real: a footnote explaining how the Preference Match formula scores categories with no direct destination-side data, and a correction to the itinerary baseline-location wording to match the actual fallback behavior. Item 33 was added after DOT raised the visitor double-counting concern in person, resulting in the QR/manual check-in feature, the new Verified Visits report, and a database-level uniqueness constraint (§5.23). All three are also Done. Only the “No action needed” items remain untouched, by design.</w:t>
       </w:r>
     </w:p>
-    <w:p>
-      <w:pPr>
-        <w:pStyle w:val="Heading1"/>
-      </w:pPr>
-      <w:r>
-        <w:t>10. Work in Progress (Not Merged): Accreditation Labels (DOT Accredited, Sample Data, Not Yet Verified)</w:t>
-      </w:r>
-    </w:p>
-    <w:p>
-      <w:r>
-        <w:rPr>
-          <w:b/>
-        </w:rPr>
-        <w:t>STATUS: implemented on the local branch feature/data-provenance-labels. NOT approved for merging. NOT deployed. Separate from the stay-continuity work (feature/stay-continuity-stage1).</w:t>
-      </w:r>
-    </w:p>
-    <w:p>
-      <w:pPr>
-        <w:pStyle w:val="Heading2"/>
-      </w:pPr>
-      <w:r>
-        <w:t>10.1 What it does</w:t>
-      </w:r>
-    </w:p>
-    <w:p>
-      <w:r>
-        <w:t>Every listing is shown as exactly one of three things, decided from its accreditation records (accreditation_records, using the existing is_placeholder flag; no new column):</w:t>
-      </w:r>
-    </w:p>
-    <w:tbl>
-      <w:tblPr>
-        <w:tblStyle w:val="LightGrid-Accent1"/>
-        <w:tblW w:type="auto" w:w="0"/>
-        <w:tblLook w:firstColumn="1" w:firstRow="1" w:lastColumn="0" w:lastRow="0" w:noHBand="0" w:noVBand="1" w:val="04A0"/>
-      </w:tblPr>
-      <w:tblGrid>
-        <w:gridCol w:w="2880"/>
-        <w:gridCol w:w="2880"/>
-        <w:gridCol w:w="2880"/>
-      </w:tblGrid>
-      <w:tr>
-        <w:tc>
-          <w:tcPr>
-            <w:tcW w:type="dxa" w:w="2880"/>
-          </w:tcPr>
-          <w:p>
-            <w:r>
-              <w:t>Label</w:t>
-            </w:r>
-          </w:p>
-        </w:tc>
-        <w:tc>
-          <w:tcPr>
-            <w:tcW w:type="dxa" w:w="2880"/>
-          </w:tcPr>
-          <w:p>
-            <w:r>
-              <w:t>Rule</w:t>
-            </w:r>
-          </w:p>
-        </w:tc>
-        <w:tc>
-          <w:tcPr>
-            <w:tcW w:type="dxa" w:w="2880"/>
-          </w:tcPr>
-          <w:p>
-            <w:r>
-              <w:t>Meaning</w:t>
-            </w:r>
-          </w:p>
-        </w:tc>
-      </w:tr>
-      <w:tr>
-        <w:tc>
-          <w:tcPr>
-            <w:tcW w:type="dxa" w:w="2880"/>
-          </w:tcPr>
-          <w:p>
-            <w:r>
-              <w:t>DOT Accredited</w:t>
-            </w:r>
-          </w:p>
-        </w:tc>
-        <w:tc>
-          <w:tcPr>
-            <w:tcW w:type="dxa" w:w="2880"/>
-          </w:tcPr>
-          <w:p>
-            <w:r>
-              <w:t>at least one record that is not a placeholder and carries an accreditation number</w:t>
-            </w:r>
-          </w:p>
-        </w:tc>
-        <w:tc>
-          <w:tcPr>
-            <w:tcW w:type="dxa" w:w="2880"/>
-          </w:tcPr>
-          <w:p>
-            <w:r>
-              <w:t>official DOT record</w:t>
-            </w:r>
-          </w:p>
-        </w:tc>
-      </w:tr>
-      <w:tr>
-        <w:tc>
-          <w:tcPr>
-            <w:tcW w:type="dxa" w:w="2880"/>
-          </w:tcPr>
-          <w:p>
-            <w:r>
-              <w:t>Sample Data</w:t>
-            </w:r>
-          </w:p>
-        </w:tc>
-        <w:tc>
-          <w:tcPr>
-            <w:tcW w:type="dxa" w:w="2880"/>
-          </w:tcPr>
-          <w:p>
-            <w:r>
-              <w:t>every record is a placeholder (our number, not DOT's)</w:t>
-            </w:r>
-          </w:p>
-        </w:tc>
-        <w:tc>
-          <w:tcPr>
-            <w:tcW w:type="dxa" w:w="2880"/>
-          </w:tcPr>
-          <w:p>
-            <w:r>
-              <w:t>temporary demonstration record</w:t>
-            </w:r>
-          </w:p>
-        </w:tc>
-      </w:tr>
-      <w:tr>
-        <w:tc>
-          <w:tcPr>
-            <w:tcW w:type="dxa" w:w="2880"/>
-          </w:tcPr>
-          <w:p>
-            <w:r>
-              <w:t>Not Yet Verified</w:t>
-            </w:r>
-          </w:p>
-        </w:tc>
-        <w:tc>
-          <w:tcPr>
-            <w:tcW w:type="dxa" w:w="2880"/>
-          </w:tcPr>
-          <w:p>
-            <w:r>
-              <w:t>no accreditation record, or only records without a number</w:t>
-            </w:r>
-          </w:p>
-        </w:tc>
-        <w:tc>
-          <w:tcPr>
-            <w:tcW w:type="dxa" w:w="2880"/>
-          </w:tcPr>
-          <w:p>
-            <w:r>
-              <w:t>accreditation cannot be confirmed</w:t>
-            </w:r>
-          </w:p>
-        </w:tc>
-      </w:tr>
-    </w:tbl>
-    <w:p/>
-    <w:p>
-      <w:r>
-        <w:t>A missing record is never read as official. The label is the same on the catalogue cards, the destination, stay, dining, souvenir, operator and package pages, the chatbot and the planner's provenance panel. Home-page wording that called every listing "DOT-verified" was replaced, and the site description no longer claims that all destinations are DOT-accredited.</w:t>
-      </w:r>
-    </w:p>
-    <w:p>
-      <w:pPr>
-        <w:pStyle w:val="Heading2"/>
-      </w:pPr>
-      <w:r>
-        <w:t>10.2 What it does not do</w:t>
-      </w:r>
-    </w:p>
-    <w:p>
-      <w:pPr>
-        <w:pStyle w:val="ListBullet"/>
-      </w:pPr>
-      <w:r>
-        <w:t>It does not change eligibility. Sample and Not Yet Verified listings stay in the Content-Based Recommendation, Apriori, itinerary generation and geographic sequencing, because those use the is_accredited flag only.</w:t>
-      </w:r>
-    </w:p>
-    <w:p>
-      <w:pPr>
-        <w:pStyle w:val="ListBullet"/>
-      </w:pPr>
-      <w:r>
-        <w:t>It does not change any recommendation algorithm or weight, any accreditation value, any expiry date, the grace setting, prices, or existing listing records.</w:t>
-      </w:r>
-    </w:p>
-    <w:p>
-      <w:pPr>
-        <w:pStyle w:val="Heading2"/>
-      </w:pPr>
-      <w:r>
-        <w:t>10.3 Verification</w:t>
-      </w:r>
-    </w:p>
-    <w:p>
-      <w:r>
-        <w:t>SampleParticipationTest plans the same catalogue with every record official, every record sample, no records, and a mix, and requires identical rankings (factor by factor), stops, order and stays; a control shows the comparison does detect a real difference. It also checks that Apriori treats a sample destination like an official one and that the recommendation code never reads provenance. ProvenanceStatusTest covers the three states on every surface.</w:t>
-      </w:r>
-    </w:p>
-    <w:p>
-      <w:pPr>
-        <w:pStyle w:val="Heading2"/>
-      </w:pPr>
-      <w:r>
-        <w:t>10.4 Test data, not verified DOT information</w:t>
-      </w:r>
-    </w:p>
-    <w:p>
-      <w:r>
-        <w:t>The sample records are a temporary beta-testing arrangement and must eventually be replaced with verified DOT records. Existing accreditation values, expiry dates and prices were not changed.</w:t>
-      </w:r>
-    </w:p>
     <w:sectPr>
       <w:pgSz w:w="12240" w:h="15840"/>
       <w:pgMar w:top="1440" w:right="1800" w:bottom="1440" w:left="1800" w:header="720" w:footer="720" w:gutter="0"/>

</xml_diff>